<commit_message>
updating files in assets
</commit_message>
<xml_diff>
--- a/assets/cv/cv-de.docx
+++ b/assets/cv/cv-de.docx
@@ -24,12 +24,6 @@
         <w:gridCol w:w="8146"/>
       </w:tblGrid>
       <w:tr>
-        <w:tblPrEx>
-          <w:tblCellMar>
-            <w:top w:w="0" w:type="dxa"/>
-            <w:bottom w:w="0" w:type="dxa"/>
-          </w:tblCellMar>
-        </w:tblPrEx>
         <w:trPr>
           <w:trHeight w:val="16830"/>
         </w:trPr>
@@ -111,6 +105,9 @@
             <w:pPr>
               <w:spacing w:after="60"/>
               <w:jc w:val="center"/>
+              <w:rPr>
+                <w:lang w:val="de-DE"/>
+              </w:rPr>
             </w:pPr>
             <w:r>
               <w:rPr>
@@ -120,6 +117,7 @@
                 <w:color w:val="FFFFFF"/>
                 <w:sz w:val="30"/>
                 <w:szCs w:val="30"/>
+                <w:lang w:val="de-DE"/>
               </w:rPr>
               <w:t>Ghazal Arbabzadeh</w:t>
             </w:r>
@@ -127,11 +125,15 @@
           <w:p>
             <w:pPr>
               <w:jc w:val="center"/>
+              <w:rPr>
+                <w:lang w:val="de-DE"/>
+              </w:rPr>
             </w:pPr>
             <w:r>
               <w:rPr>
                 <w:rFonts w:ascii="Arial" w:eastAsia="Arial" w:hAnsi="Arial" w:cs="Arial"/>
                 <w:color w:val="A8C8C7"/>
+                <w:lang w:val="de-DE"/>
               </w:rPr>
               <w:t>Informatikstudentin · FH Campus Wien</w:t>
             </w:r>
@@ -142,11 +144,17 @@
                 <w:bottom w:val="single" w:sz="3" w:space="0" w:color="2A5554"/>
               </w:pBdr>
               <w:spacing w:before="80"/>
+              <w:rPr>
+                <w:lang w:val="de-DE"/>
+              </w:rPr>
             </w:pPr>
           </w:p>
           <w:p>
             <w:pPr>
               <w:spacing w:before="340" w:after="120"/>
+              <w:rPr>
+                <w:lang w:val="de-DE"/>
+              </w:rPr>
             </w:pPr>
             <w:r>
               <w:rPr>
@@ -157,6 +165,7 @@
                 <w:spacing w:val="60"/>
                 <w:sz w:val="18"/>
                 <w:szCs w:val="18"/>
+                <w:lang w:val="de-DE"/>
               </w:rPr>
               <w:t>KONTAKT</w:t>
             </w:r>
@@ -242,6 +251,7 @@
               <w:spacing w:after="40"/>
               <w:rPr>
                 <w:color w:val="95DCF7" w:themeColor="accent4" w:themeTint="66"/>
+                <w:lang w:val="de-DE"/>
               </w:rPr>
             </w:pPr>
             <w:hyperlink r:id="rId7" w:history="1">
@@ -261,17 +271,21 @@
               <w:spacing w:after="40"/>
               <w:rPr>
                 <w:color w:val="95DCF7" w:themeColor="accent4" w:themeTint="66"/>
+                <w:lang w:val="de-DE"/>
               </w:rPr>
             </w:pPr>
             <w:hyperlink r:id="rId8" w:history="1">
+              <w:proofErr w:type="spellStart"/>
               <w:r>
                 <w:rPr>
                   <w:rStyle w:val="Hyperlink"/>
                   <w:rFonts w:ascii="Arial" w:eastAsia="Arial" w:hAnsi="Arial" w:cs="Arial"/>
                   <w:color w:val="95DCF7" w:themeColor="accent4" w:themeTint="66"/>
+                  <w:lang w:val="de-DE"/>
                 </w:rPr>
                 <w:t>Github</w:t>
               </w:r>
+              <w:proofErr w:type="spellEnd"/>
             </w:hyperlink>
           </w:p>
           <w:p>
@@ -280,11 +294,17 @@
                 <w:bottom w:val="single" w:sz="3" w:space="0" w:color="2A5554"/>
               </w:pBdr>
               <w:spacing w:before="80"/>
+              <w:rPr>
+                <w:lang w:val="de-DE"/>
+              </w:rPr>
             </w:pPr>
           </w:p>
           <w:p>
             <w:pPr>
               <w:spacing w:before="340" w:after="120"/>
+              <w:rPr>
+                <w:lang w:val="de-DE"/>
+              </w:rPr>
             </w:pPr>
             <w:r>
               <w:rPr>
@@ -295,6 +315,7 @@
                 <w:spacing w:val="60"/>
                 <w:sz w:val="18"/>
                 <w:szCs w:val="18"/>
+                <w:lang w:val="de-DE"/>
               </w:rPr>
               <w:t>TECHNISCHE KENNTNISSE</w:t>
             </w:r>
@@ -302,6 +323,9 @@
           <w:p>
             <w:pPr>
               <w:spacing w:after="40"/>
+              <w:rPr>
+                <w:lang w:val="de-DE"/>
+              </w:rPr>
             </w:pPr>
             <w:r>
               <w:rPr>
@@ -309,6 +333,7 @@
                 <w:color w:val="FFFFFF"/>
                 <w:sz w:val="22"/>
                 <w:szCs w:val="22"/>
+                <w:lang w:val="de-DE"/>
               </w:rPr>
               <w:t>Python · Java · JavaScript · SQL</w:t>
             </w:r>
@@ -380,6 +405,9 @@
           <w:p>
             <w:pPr>
               <w:spacing w:before="340" w:after="120"/>
+              <w:rPr>
+                <w:lang w:val="de-DE"/>
+              </w:rPr>
             </w:pPr>
             <w:r>
               <w:rPr>
@@ -390,6 +418,7 @@
                 <w:spacing w:val="60"/>
                 <w:sz w:val="18"/>
                 <w:szCs w:val="18"/>
+                <w:lang w:val="de-DE"/>
               </w:rPr>
               <w:t>SPRACHEN</w:t>
             </w:r>
@@ -397,6 +426,9 @@
           <w:p>
             <w:pPr>
               <w:spacing w:after="40"/>
+              <w:rPr>
+                <w:lang w:val="de-DE"/>
+              </w:rPr>
             </w:pPr>
             <w:r>
               <w:rPr>
@@ -404,6 +436,7 @@
                 <w:color w:val="FFFFFF"/>
                 <w:sz w:val="22"/>
                 <w:szCs w:val="22"/>
+                <w:lang w:val="de-DE"/>
               </w:rPr>
               <w:t>Englisch: Fließend</w:t>
             </w:r>
@@ -411,6 +444,9 @@
           <w:p>
             <w:pPr>
               <w:spacing w:after="40"/>
+              <w:rPr>
+                <w:lang w:val="de-DE"/>
+              </w:rPr>
             </w:pPr>
             <w:r>
               <w:rPr>
@@ -418,6 +454,7 @@
                 <w:color w:val="FFFFFF"/>
                 <w:sz w:val="22"/>
                 <w:szCs w:val="22"/>
+                <w:lang w:val="de-DE"/>
               </w:rPr>
               <w:t>Deutsch: Fließend</w:t>
             </w:r>
@@ -430,6 +467,7 @@
                 <w:color w:val="FFFFFF"/>
                 <w:sz w:val="22"/>
                 <w:szCs w:val="22"/>
+                <w:lang w:val="de-DE"/>
               </w:rPr>
             </w:pPr>
             <w:r>
@@ -438,6 +476,7 @@
                 <w:color w:val="FFFFFF"/>
                 <w:sz w:val="22"/>
                 <w:szCs w:val="22"/>
+                <w:lang w:val="de-DE"/>
               </w:rPr>
               <w:t>Persisch: Muttersprache</w:t>
             </w:r>
@@ -448,6 +487,9 @@
                 <w:bottom w:val="single" w:sz="3" w:space="0" w:color="2A5554"/>
               </w:pBdr>
               <w:spacing w:before="80"/>
+              <w:rPr>
+                <w:lang w:val="de-DE"/>
+              </w:rPr>
             </w:pPr>
           </w:p>
           <w:p>
@@ -563,6 +605,9 @@
           <w:p>
             <w:pPr>
               <w:spacing w:before="320" w:after="40"/>
+              <w:rPr>
+                <w:lang w:val="de-DE"/>
+              </w:rPr>
             </w:pPr>
             <w:r>
               <w:rPr>
@@ -572,6 +617,7 @@
                 <w:color w:val="111111"/>
                 <w:sz w:val="60"/>
                 <w:szCs w:val="60"/>
+                <w:lang w:val="de-DE"/>
               </w:rPr>
               <w:t>Ghazal Arbabzadeh</w:t>
             </w:r>
@@ -579,15 +625,31 @@
           <w:p>
             <w:pPr>
               <w:spacing w:after="20"/>
-            </w:pPr>
+              <w:rPr>
+                <w:lang w:val="de-DE"/>
+              </w:rPr>
+            </w:pPr>
+            <w:proofErr w:type="gramStart"/>
             <w:r>
               <w:rPr>
                 <w:rFonts w:ascii="Arial" w:eastAsia="Arial" w:hAnsi="Arial" w:cs="Arial"/>
                 <w:color w:val="248984"/>
                 <w:sz w:val="26"/>
                 <w:szCs w:val="26"/>
-              </w:rPr>
-              <w:t>Informatikstudentin  ·  Wien</w:t>
+                <w:lang w:val="de-DE"/>
+              </w:rPr>
+              <w:t>Informatikstudentin  ·</w:t>
+            </w:r>
+            <w:proofErr w:type="gramEnd"/>
+            <w:r>
+              <w:rPr>
+                <w:rFonts w:ascii="Arial" w:eastAsia="Arial" w:hAnsi="Arial" w:cs="Arial"/>
+                <w:color w:val="248984"/>
+                <w:sz w:val="26"/>
+                <w:szCs w:val="26"/>
+                <w:lang w:val="de-DE"/>
+              </w:rPr>
+              <w:t xml:space="preserve">  Wien</w:t>
             </w:r>
           </w:p>
           <w:p>
@@ -596,6 +658,9 @@
                 <w:bottom w:val="single" w:sz="6" w:space="0" w:color="248984"/>
               </w:pBdr>
               <w:spacing w:before="320" w:after="100"/>
+              <w:rPr>
+                <w:lang w:val="de-DE"/>
+              </w:rPr>
             </w:pPr>
             <w:r>
               <w:rPr>
@@ -606,6 +671,7 @@
                 <w:spacing w:val="50"/>
                 <w:sz w:val="22"/>
                 <w:szCs w:val="22"/>
+                <w:lang w:val="de-DE"/>
               </w:rPr>
               <w:t>PROFIL</w:t>
             </w:r>
@@ -614,6 +680,9 @@
             <w:pPr>
               <w:spacing w:before="60"/>
               <w:jc w:val="both"/>
+              <w:rPr>
+                <w:lang w:val="de-DE"/>
+              </w:rPr>
             </w:pPr>
             <w:r>
               <w:rPr>
@@ -621,8 +690,53 @@
                 <w:color w:val="444444"/>
                 <w:sz w:val="23"/>
                 <w:szCs w:val="23"/>
-              </w:rPr>
-              <w:t>Informatikstudentin an der FH Campus Wien mit einem medizinischen Hintergrund. Ich kombiniere analytisches Denken mit praktischer Erfahrung in Full-Stack-Entwicklung, Datenanalyse und Machine Learning. Ich arbeite strukturiert, zuverlässig und übernehme gerne Verantwortung in echten Projekten.</w:t>
+                <w:lang w:val="de-DE"/>
+              </w:rPr>
+              <w:t xml:space="preserve">Informatikstudentin an der FH Campus Wien mit einem medizinischen Hintergrund. Ich kombiniere analytisches Denken mit praktischer Erfahrung in </w:t>
+            </w:r>
+            <w:proofErr w:type="spellStart"/>
+            <w:r>
+              <w:rPr>
+                <w:rFonts w:ascii="Arial" w:eastAsia="Arial" w:hAnsi="Arial" w:cs="Arial"/>
+                <w:color w:val="444444"/>
+                <w:sz w:val="23"/>
+                <w:szCs w:val="23"/>
+                <w:lang w:val="de-DE"/>
+              </w:rPr>
+              <w:t>Full</w:t>
+            </w:r>
+            <w:proofErr w:type="spellEnd"/>
+            <w:r>
+              <w:rPr>
+                <w:rFonts w:ascii="Arial" w:eastAsia="Arial" w:hAnsi="Arial" w:cs="Arial"/>
+                <w:color w:val="444444"/>
+                <w:sz w:val="23"/>
+                <w:szCs w:val="23"/>
+                <w:lang w:val="de-DE"/>
+              </w:rPr>
+              <w:t xml:space="preserve">-Stack-Entwicklung, Datenanalyse und </w:t>
+            </w:r>
+            <w:proofErr w:type="spellStart"/>
+            <w:r>
+              <w:rPr>
+                <w:rFonts w:ascii="Arial" w:eastAsia="Arial" w:hAnsi="Arial" w:cs="Arial"/>
+                <w:color w:val="444444"/>
+                <w:sz w:val="23"/>
+                <w:szCs w:val="23"/>
+                <w:lang w:val="de-DE"/>
+              </w:rPr>
+              <w:t>Machine</w:t>
+            </w:r>
+            <w:proofErr w:type="spellEnd"/>
+            <w:r>
+              <w:rPr>
+                <w:rFonts w:ascii="Arial" w:eastAsia="Arial" w:hAnsi="Arial" w:cs="Arial"/>
+                <w:color w:val="444444"/>
+                <w:sz w:val="23"/>
+                <w:szCs w:val="23"/>
+                <w:lang w:val="de-DE"/>
+              </w:rPr>
+              <w:t xml:space="preserve"> Learning. Ich arbeite strukturiert, zuverlässig und übernehme gerne Verantwortung in echten Projekten.</w:t>
             </w:r>
           </w:p>
           <w:p>
@@ -631,6 +745,9 @@
                 <w:bottom w:val="single" w:sz="6" w:space="0" w:color="248984"/>
               </w:pBdr>
               <w:spacing w:before="320" w:after="100"/>
+              <w:rPr>
+                <w:lang w:val="de-DE"/>
+              </w:rPr>
             </w:pPr>
             <w:r>
               <w:rPr>
@@ -641,6 +758,7 @@
                 <w:spacing w:val="50"/>
                 <w:sz w:val="22"/>
                 <w:szCs w:val="22"/>
+                <w:lang w:val="de-DE"/>
               </w:rPr>
               <w:t>AUSBILDUNG</w:t>
             </w:r>
@@ -651,7 +769,11 @@
                 <w:tab w:val="right" w:pos="7426"/>
               </w:tabs>
               <w:spacing w:before="200" w:after="40"/>
-            </w:pPr>
+              <w:rPr>
+                <w:lang w:val="de-DE"/>
+              </w:rPr>
+            </w:pPr>
+            <w:proofErr w:type="spellStart"/>
             <w:r>
               <w:rPr>
                 <w:rFonts w:ascii="Arial" w:eastAsia="Arial" w:hAnsi="Arial" w:cs="Arial"/>
@@ -660,8 +782,22 @@
                 <w:color w:val="111111"/>
                 <w:sz w:val="26"/>
                 <w:szCs w:val="26"/>
-              </w:rPr>
-              <w:t>BSc Computer Science &amp; Digital Communications</w:t>
+                <w:lang w:val="de-DE"/>
+              </w:rPr>
+              <w:t>BSc</w:t>
+            </w:r>
+            <w:proofErr w:type="spellEnd"/>
+            <w:r>
+              <w:rPr>
+                <w:rFonts w:ascii="Arial" w:eastAsia="Arial" w:hAnsi="Arial" w:cs="Arial"/>
+                <w:b/>
+                <w:bCs/>
+                <w:color w:val="111111"/>
+                <w:sz w:val="26"/>
+                <w:szCs w:val="26"/>
+                <w:lang w:val="de-DE"/>
+              </w:rPr>
+              <w:t xml:space="preserve"> Computer Science &amp; Digital Communications</w:t>
             </w:r>
             <w:r>
               <w:rPr>
@@ -671,14 +807,44 @@
                 <w:color w:val="888888"/>
                 <w:sz w:val="21"/>
                 <w:szCs w:val="21"/>
+                <w:lang w:val="de-DE"/>
               </w:rPr>
               <w:tab/>
-              <w:t>Sep 2025 –                                                    .                                                                                                           Jun 2028</w:t>
+              <w:t xml:space="preserve">Sep 2025 –                                                  </w:t>
+            </w:r>
+            <w:proofErr w:type="gramStart"/>
+            <w:r>
+              <w:rPr>
+                <w:rFonts w:ascii="Arial" w:eastAsia="Arial" w:hAnsi="Arial" w:cs="Arial"/>
+                <w:i/>
+                <w:iCs/>
+                <w:color w:val="888888"/>
+                <w:sz w:val="21"/>
+                <w:szCs w:val="21"/>
+                <w:lang w:val="de-DE"/>
+              </w:rPr>
+              <w:t xml:space="preserve">  .</w:t>
+            </w:r>
+            <w:proofErr w:type="gramEnd"/>
+            <w:r>
+              <w:rPr>
+                <w:rFonts w:ascii="Arial" w:eastAsia="Arial" w:hAnsi="Arial" w:cs="Arial"/>
+                <w:i/>
+                <w:iCs/>
+                <w:color w:val="888888"/>
+                <w:sz w:val="21"/>
+                <w:szCs w:val="21"/>
+                <w:lang w:val="de-DE"/>
+              </w:rPr>
+              <w:t xml:space="preserve">                                                                                                           Jun 2028</w:t>
             </w:r>
           </w:p>
           <w:p>
             <w:pPr>
               <w:spacing w:after="40"/>
+              <w:rPr>
+                <w:lang w:val="de-DE"/>
+              </w:rPr>
             </w:pPr>
             <w:r>
               <w:rPr>
@@ -686,8 +852,19 @@
                 <w:color w:val="248984"/>
                 <w:sz w:val="22"/>
                 <w:szCs w:val="22"/>
-              </w:rPr>
-              <w:t>FH Campus Wien — Fachhochschule, Wien</w:t>
+                <w:lang w:val="de-DE"/>
+              </w:rPr>
+              <w:t>FH Campus Wien</w:t>
+            </w:r>
+            <w:r>
+              <w:rPr>
+                <w:rFonts w:ascii="Arial" w:eastAsia="Arial" w:hAnsi="Arial" w:cs="Arial"/>
+                <w:color w:val="248984"/>
+                <w:sz w:val="22"/>
+                <w:szCs w:val="22"/>
+                <w:lang w:val="de-DE"/>
+              </w:rPr>
+              <w:t>, Wien, Österreich</w:t>
             </w:r>
           </w:p>
           <w:p>
@@ -696,6 +873,9 @@
                 <w:tab w:val="right" w:pos="7426"/>
               </w:tabs>
               <w:spacing w:before="200" w:after="40"/>
+              <w:rPr>
+                <w:lang w:val="de-DE"/>
+              </w:rPr>
             </w:pPr>
             <w:r>
               <w:rPr>
@@ -705,8 +885,35 @@
                 <w:color w:val="111111"/>
                 <w:sz w:val="26"/>
                 <w:szCs w:val="26"/>
-              </w:rPr>
-              <w:t>Zahnärztin (Dr. med. dent.)</w:t>
+                <w:lang w:val="de-DE"/>
+              </w:rPr>
+              <w:t xml:space="preserve">Zahnärztin (Dr. med. </w:t>
+            </w:r>
+            <w:proofErr w:type="spellStart"/>
+            <w:r>
+              <w:rPr>
+                <w:rFonts w:ascii="Arial" w:eastAsia="Arial" w:hAnsi="Arial" w:cs="Arial"/>
+                <w:b/>
+                <w:bCs/>
+                <w:color w:val="111111"/>
+                <w:sz w:val="26"/>
+                <w:szCs w:val="26"/>
+                <w:lang w:val="de-DE"/>
+              </w:rPr>
+              <w:t>dent</w:t>
+            </w:r>
+            <w:proofErr w:type="spellEnd"/>
+            <w:r>
+              <w:rPr>
+                <w:rFonts w:ascii="Arial" w:eastAsia="Arial" w:hAnsi="Arial" w:cs="Arial"/>
+                <w:b/>
+                <w:bCs/>
+                <w:color w:val="111111"/>
+                <w:sz w:val="26"/>
+                <w:szCs w:val="26"/>
+                <w:lang w:val="de-DE"/>
+              </w:rPr>
+              <w:t>.)</w:t>
             </w:r>
             <w:r>
               <w:rPr>
@@ -716,6 +923,7 @@
                 <w:color w:val="888888"/>
                 <w:sz w:val="21"/>
                 <w:szCs w:val="21"/>
+                <w:lang w:val="de-DE"/>
               </w:rPr>
               <w:tab/>
               <w:t>2015 – 2021</w:t>
@@ -724,6 +932,9 @@
           <w:p>
             <w:pPr>
               <w:spacing w:after="40"/>
+              <w:rPr>
+                <w:lang w:val="de-DE"/>
+              </w:rPr>
             </w:pPr>
             <w:r>
               <w:rPr>
@@ -731,6 +942,7 @@
                 <w:color w:val="248984"/>
                 <w:sz w:val="22"/>
                 <w:szCs w:val="22"/>
+                <w:lang w:val="de-DE"/>
               </w:rPr>
               <w:t>Azad University, Isfahan, Iran</w:t>
             </w:r>
@@ -741,6 +953,9 @@
                 <w:bottom w:val="single" w:sz="6" w:space="0" w:color="248984"/>
               </w:pBdr>
               <w:spacing w:before="320" w:after="100"/>
+              <w:rPr>
+                <w:lang w:val="de-DE"/>
+              </w:rPr>
             </w:pPr>
             <w:r>
               <w:rPr>
@@ -751,6 +966,7 @@
                 <w:spacing w:val="50"/>
                 <w:sz w:val="22"/>
                 <w:szCs w:val="22"/>
+                <w:lang w:val="de-DE"/>
               </w:rPr>
               <w:t>BERUFSERFAHRUNG</w:t>
             </w:r>
@@ -761,6 +977,9 @@
                 <w:tab w:val="right" w:pos="7426"/>
               </w:tabs>
               <w:spacing w:before="200" w:after="40"/>
+              <w:rPr>
+                <w:lang w:val="de-DE"/>
+              </w:rPr>
             </w:pPr>
             <w:r>
               <w:rPr>
@@ -770,6 +989,7 @@
                 <w:color w:val="111111"/>
                 <w:sz w:val="26"/>
                 <w:szCs w:val="26"/>
+                <w:lang w:val="de-DE"/>
               </w:rPr>
               <w:t>Sales Assistant (Teilzeit)</w:t>
             </w:r>
@@ -781,14 +1001,32 @@
                 <w:color w:val="888888"/>
                 <w:sz w:val="21"/>
                 <w:szCs w:val="21"/>
+                <w:lang w:val="de-DE"/>
               </w:rPr>
               <w:tab/>
-              <w:t>2024 – Present</w:t>
-            </w:r>
+              <w:t xml:space="preserve">2024 – </w:t>
+            </w:r>
+            <w:proofErr w:type="spellStart"/>
+            <w:r>
+              <w:rPr>
+                <w:rFonts w:ascii="Arial" w:eastAsia="Arial" w:hAnsi="Arial" w:cs="Arial"/>
+                <w:i/>
+                <w:iCs/>
+                <w:color w:val="888888"/>
+                <w:sz w:val="21"/>
+                <w:szCs w:val="21"/>
+                <w:lang w:val="de-DE"/>
+              </w:rPr>
+              <w:t>Present</w:t>
+            </w:r>
+            <w:proofErr w:type="spellEnd"/>
           </w:p>
           <w:p>
             <w:pPr>
               <w:spacing w:after="40"/>
+              <w:rPr>
+                <w:lang w:val="de-DE"/>
+              </w:rPr>
             </w:pPr>
             <w:r>
               <w:rPr>
@@ -796,6 +1034,7 @@
                 <w:color w:val="248984"/>
                 <w:sz w:val="22"/>
                 <w:szCs w:val="22"/>
+                <w:lang w:val="de-DE"/>
               </w:rPr>
               <w:t>Julius Meinl am Graben, Wien</w:t>
             </w:r>
@@ -804,6 +1043,9 @@
             <w:pPr>
               <w:spacing w:before="20" w:after="20"/>
               <w:ind w:left="200"/>
+              <w:rPr>
+                <w:lang w:val="de-DE"/>
+              </w:rPr>
             </w:pPr>
             <w:r>
               <w:rPr>
@@ -811,6 +1053,7 @@
                 <w:color w:val="248984"/>
                 <w:sz w:val="22"/>
                 <w:szCs w:val="22"/>
+                <w:lang w:val="de-DE"/>
               </w:rPr>
               <w:t xml:space="preserve">–  </w:t>
             </w:r>
@@ -820,6 +1063,7 @@
                 <w:color w:val="444444"/>
                 <w:sz w:val="22"/>
                 <w:szCs w:val="22"/>
+                <w:lang w:val="de-DE"/>
               </w:rPr>
               <w:t>Kundenservice in einem internationalen, mehrsprachigen Umfeld (DE / EN)</w:t>
             </w:r>
@@ -828,6 +1072,9 @@
             <w:pPr>
               <w:spacing w:before="20" w:after="20"/>
               <w:ind w:left="200"/>
+              <w:rPr>
+                <w:lang w:val="de-DE"/>
+              </w:rPr>
             </w:pPr>
             <w:r>
               <w:rPr>
@@ -835,6 +1082,7 @@
                 <w:color w:val="248984"/>
                 <w:sz w:val="22"/>
                 <w:szCs w:val="22"/>
+                <w:lang w:val="de-DE"/>
               </w:rPr>
               <w:t xml:space="preserve">–  </w:t>
             </w:r>
@@ -844,6 +1092,7 @@
                 <w:color w:val="444444"/>
                 <w:sz w:val="22"/>
                 <w:szCs w:val="22"/>
+                <w:lang w:val="de-DE"/>
               </w:rPr>
               <w:t>Zuverlässige und strukturierte Aufgabenerfüllung unter Druck</w:t>
             </w:r>
@@ -854,6 +1103,9 @@
                 <w:tab w:val="right" w:pos="7426"/>
               </w:tabs>
               <w:spacing w:before="200" w:after="40"/>
+              <w:rPr>
+                <w:lang w:val="de-DE"/>
+              </w:rPr>
             </w:pPr>
             <w:r>
               <w:rPr>
@@ -863,6 +1115,7 @@
                 <w:color w:val="111111"/>
                 <w:sz w:val="26"/>
                 <w:szCs w:val="26"/>
+                <w:lang w:val="de-DE"/>
               </w:rPr>
               <w:t>Zahnärztin</w:t>
             </w:r>
@@ -874,6 +1127,7 @@
                 <w:color w:val="888888"/>
                 <w:sz w:val="21"/>
                 <w:szCs w:val="21"/>
+                <w:lang w:val="de-DE"/>
               </w:rPr>
               <w:tab/>
               <w:t>2021 – 2024</w:t>
@@ -882,6 +1136,9 @@
           <w:p>
             <w:pPr>
               <w:spacing w:after="40"/>
+              <w:rPr>
+                <w:lang w:val="de-DE"/>
+              </w:rPr>
             </w:pPr>
             <w:r>
               <w:rPr>
@@ -889,6 +1146,7 @@
                 <w:color w:val="248984"/>
                 <w:sz w:val="22"/>
                 <w:szCs w:val="22"/>
+                <w:lang w:val="de-DE"/>
               </w:rPr>
               <w:t>Eigene Praxis, Iran</w:t>
             </w:r>
@@ -897,6 +1155,9 @@
             <w:pPr>
               <w:spacing w:before="20" w:after="20"/>
               <w:ind w:left="200"/>
+              <w:rPr>
+                <w:lang w:val="de-DE"/>
+              </w:rPr>
             </w:pPr>
             <w:r>
               <w:rPr>
@@ -904,6 +1165,7 @@
                 <w:color w:val="248984"/>
                 <w:sz w:val="22"/>
                 <w:szCs w:val="22"/>
+                <w:lang w:val="de-DE"/>
               </w:rPr>
               <w:t xml:space="preserve">–  </w:t>
             </w:r>
@@ -913,6 +1175,7 @@
                 <w:color w:val="444444"/>
                 <w:sz w:val="22"/>
                 <w:szCs w:val="22"/>
+                <w:lang w:val="de-DE"/>
               </w:rPr>
               <w:t>Hochpräzises Arbeiten mit strukturierter Dokumentation und sensiblen Daten</w:t>
             </w:r>
@@ -921,6 +1184,9 @@
             <w:pPr>
               <w:spacing w:before="20" w:after="20"/>
               <w:ind w:left="200"/>
+              <w:rPr>
+                <w:lang w:val="de-DE"/>
+              </w:rPr>
             </w:pPr>
             <w:r>
               <w:rPr>
@@ -928,6 +1194,7 @@
                 <w:color w:val="248984"/>
                 <w:sz w:val="22"/>
                 <w:szCs w:val="22"/>
+                <w:lang w:val="de-DE"/>
               </w:rPr>
               <w:t xml:space="preserve">–  </w:t>
             </w:r>
@@ -937,6 +1204,7 @@
                 <w:color w:val="444444"/>
                 <w:sz w:val="22"/>
                 <w:szCs w:val="22"/>
+                <w:lang w:val="de-DE"/>
               </w:rPr>
               <w:t>Eigenverantwortliches Problemlösen in anspruchsvollen Situationen</w:t>
             </w:r>
@@ -947,6 +1215,9 @@
                 <w:bottom w:val="single" w:sz="6" w:space="0" w:color="248984"/>
               </w:pBdr>
               <w:spacing w:before="320" w:after="100"/>
+              <w:rPr>
+                <w:lang w:val="de-DE"/>
+              </w:rPr>
             </w:pPr>
             <w:r>
               <w:rPr>
@@ -957,6 +1228,7 @@
                 <w:spacing w:val="50"/>
                 <w:sz w:val="22"/>
                 <w:szCs w:val="22"/>
+                <w:lang w:val="de-DE"/>
               </w:rPr>
               <w:t>PROJEKTE</w:t>
             </w:r>
@@ -1010,6 +1282,9 @@
             <w:pPr>
               <w:spacing w:before="20" w:after="20"/>
               <w:ind w:left="200"/>
+              <w:rPr>
+                <w:lang w:val="de-DE"/>
+              </w:rPr>
             </w:pPr>
             <w:r>
               <w:rPr>
@@ -1017,6 +1292,7 @@
                 <w:color w:val="248984"/>
                 <w:sz w:val="22"/>
                 <w:szCs w:val="22"/>
+                <w:lang w:val="de-DE"/>
               </w:rPr>
               <w:t xml:space="preserve">–  </w:t>
             </w:r>
@@ -1026,6 +1302,7 @@
                 <w:color w:val="444444"/>
                 <w:sz w:val="22"/>
                 <w:szCs w:val="22"/>
+                <w:lang w:val="de-DE"/>
               </w:rPr>
               <w:t>Auth-Flows, Benutzerverwaltung, Datenbankdesign</w:t>
             </w:r>
@@ -1046,7 +1323,18 @@
                 <w:sz w:val="26"/>
                 <w:szCs w:val="26"/>
               </w:rPr>
-              <w:t>Java-Chatroom-Anwendung</w:t>
+              <w:t>Java-Chatroom-</w:t>
+            </w:r>
+            <w:r>
+              <w:rPr>
+                <w:rFonts w:ascii="Arial" w:eastAsia="Arial" w:hAnsi="Arial" w:cs="Arial"/>
+                <w:b/>
+                <w:bCs/>
+                <w:color w:val="111111"/>
+                <w:sz w:val="26"/>
+                <w:szCs w:val="26"/>
+              </w:rPr>
+              <w:t>Application</w:t>
             </w:r>
             <w:r>
               <w:rPr>
@@ -1058,7 +1346,18 @@
                 <w:szCs w:val="21"/>
               </w:rPr>
               <w:tab/>
-              <w:t>2026</w:t>
+              <w:t>202</w:t>
+            </w:r>
+            <w:r>
+              <w:rPr>
+                <w:rFonts w:ascii="Arial" w:eastAsia="Arial" w:hAnsi="Arial" w:cs="Arial"/>
+                <w:i/>
+                <w:iCs/>
+                <w:color w:val="888888"/>
+                <w:sz w:val="21"/>
+                <w:szCs w:val="21"/>
+              </w:rPr>
+              <w:t>5</w:t>
             </w:r>
           </w:p>
           <w:p>
@@ -1079,6 +1378,9 @@
             <w:pPr>
               <w:spacing w:before="20" w:after="20"/>
               <w:ind w:left="200"/>
+              <w:rPr>
+                <w:lang w:val="de-DE"/>
+              </w:rPr>
             </w:pPr>
             <w:r>
               <w:rPr>
@@ -1086,6 +1388,7 @@
                 <w:color w:val="248984"/>
                 <w:sz w:val="22"/>
                 <w:szCs w:val="22"/>
+                <w:lang w:val="de-DE"/>
               </w:rPr>
               <w:t xml:space="preserve">–  </w:t>
             </w:r>
@@ -1095,6 +1398,7 @@
                 <w:color w:val="444444"/>
                 <w:sz w:val="22"/>
                 <w:szCs w:val="22"/>
+                <w:lang w:val="de-DE"/>
               </w:rPr>
               <w:t>Mehrbenutzer-Echtzeit-Chat mit Socket-Programmierung</w:t>
             </w:r>
@@ -1148,6 +1452,9 @@
             <w:pPr>
               <w:spacing w:before="20" w:after="20"/>
               <w:ind w:left="200"/>
+              <w:rPr>
+                <w:lang w:val="de-DE"/>
+              </w:rPr>
             </w:pPr>
             <w:r>
               <w:rPr>
@@ -1155,6 +1462,7 @@
                 <w:color w:val="248984"/>
                 <w:sz w:val="22"/>
                 <w:szCs w:val="22"/>
+                <w:lang w:val="de-DE"/>
               </w:rPr>
               <w:t xml:space="preserve">–  </w:t>
             </w:r>
@@ -1164,6 +1472,7 @@
                 <w:color w:val="444444"/>
                 <w:sz w:val="22"/>
                 <w:szCs w:val="22"/>
+                <w:lang w:val="de-DE"/>
               </w:rPr>
               <w:t>Transfer-Learning-Modell zur Klassifikation von 102 Blumenarten</w:t>
             </w:r>
@@ -1171,35 +1480,40 @@
           <w:p>
             <w:pPr>
               <w:spacing w:before="140"/>
+              <w:rPr>
+                <w:lang w:val="de-DE"/>
+              </w:rPr>
             </w:pPr>
             <w:r>
               <w:rPr>
                 <w:rFonts w:ascii="Arial" w:eastAsia="Arial" w:hAnsi="Arial" w:cs="Arial"/>
                 <w:color w:val="888888"/>
+                <w:lang w:val="de-DE"/>
               </w:rPr>
               <w:t xml:space="preserve">Alle Projekte: </w:t>
             </w:r>
-            <w:r>
-              <w:fldChar w:fldCharType="begin"/>
-              <w:instrText>HYPERLINK "https://github.com/ghazalab96"</w:instrText>
-              <w:fldChar w:fldCharType="separate"/>
-            </w:r>
-            <w:r>
-              <w:rPr>
-                <w:rFonts w:ascii="Arial" w:eastAsia="Arial" w:hAnsi="Arial" w:cs="Arial"/>
-                <w:color w:val="248984"/>
-                <w:u w:val="single"/>
-              </w:rPr>
-              <w:t>github.com/ghazalab96</w:t>
-            </w:r>
-            <w:r>
-              <w:fldChar w:fldCharType="end"/>
-            </w:r>
+            <w:hyperlink r:id="rId9" w:history="1">
+              <w:r>
+                <w:rPr>
+                  <w:rFonts w:ascii="Arial" w:eastAsia="Arial" w:hAnsi="Arial" w:cs="Arial"/>
+                  <w:color w:val="248984"/>
+                  <w:u w:val="single"/>
+                  <w:lang w:val="de-DE"/>
+                </w:rPr>
+                <w:t>github.com/ghazalab96</w:t>
+              </w:r>
+            </w:hyperlink>
           </w:p>
         </w:tc>
       </w:tr>
     </w:tbl>
-    <w:p/>
+    <w:p>
+      <w:pPr>
+        <w:rPr>
+          <w:lang w:val="de-DE"/>
+        </w:rPr>
+      </w:pPr>
+    </w:p>
     <w:sectPr>
       <w:pgSz w:w="11906" w:h="16838"/>
       <w:pgMar w:top="0" w:right="560" w:bottom="0" w:left="0" w:header="708" w:footer="708" w:gutter="0"/>
@@ -1907,6 +2221,18 @@
       <w:shd w:val="clear" w:color="auto" w:fill="E1DFDD"/>
     </w:rPr>
   </w:style>
+  <w:style w:type="character" w:styleId="FollowedHyperlink">
+    <w:name w:val="FollowedHyperlink"/>
+    <w:basedOn w:val="DefaultParagraphFont"/>
+    <w:uiPriority w:val="99"/>
+    <w:semiHidden/>
+    <w:unhideWhenUsed/>
+    <w:rsid w:val="005B4CFC"/>
+    <w:rPr>
+      <w:color w:val="96607D" w:themeColor="followedHyperlink"/>
+      <w:u w:val="single"/>
+    </w:rPr>
+  </w:style>
 </w:styles>
 </file>
 

</xml_diff>